<commit_message>
Project guide: create repo from template (no fork), show project locally, demo checklist
</commit_message>
<xml_diff>
--- a/docs/week-15/cen207-week-15-notes.en.docx
+++ b/docs/week-15/cen207-week-15-notes.en.docx
@@ -2,7 +2,7 @@
 <file path=word/document.xml><?xml version="1.0" encoding="utf-8"?>
 <w:document xmlns:w="http://schemas.openxmlformats.org/wordprocessingml/2006/main" xmlns:m="http://schemas.openxmlformats.org/officeDocument/2006/math" xmlns:r="http://schemas.openxmlformats.org/officeDocument/2006/relationships" xmlns:o="urn:schemas-microsoft-com:office:office" xmlns:v="urn:schemas-microsoft-com:vml" xmlns:w10="urn:schemas-microsoft-com:office:word" xmlns:a="http://schemas.openxmlformats.org/drawingml/2006/main" xmlns:pic="http://schemas.openxmlformats.org/drawingml/2006/picture" xmlns:wp="http://schemas.openxmlformats.org/drawingml/2006/wordprocessingDrawing">
   <w:body>
-    <w:bookmarkStart w:id="21" w:name="week-15-final-project-demos"/>
+    <w:bookmarkStart w:id="23" w:name="week-15-final-project-demos"/>
     <w:p>
       <w:pPr>
         <w:pStyle w:val="Heading1"/>
@@ -127,7 +127,228 @@
         <w:t xml:space="preserve">Quiz-2 (weeks 9–14) in the final exam period.</w:t>
       </w:r>
     </w:p>
-    <w:bookmarkEnd w:id="21"/>
+    <w:bookmarkStart w:id="22" w:name="demo-checklist-local"/>
+    <w:p>
+      <w:pPr>
+        <w:pStyle w:val="Heading3"/>
+      </w:pPr>
+      <w:r>
+        <w:t xml:space="preserve">Demo checklist (local)</w:t>
+      </w:r>
+    </w:p>
+    <w:p>
+      <w:pPr>
+        <w:pStyle w:val="FirstParagraph"/>
+      </w:pPr>
+      <w:r>
+        <w:t xml:space="preserve">A private repository has no GitHub Pages site, so you show the project locally (details:</w:t>
+      </w:r>
+      <w:r>
+        <w:t xml:space="preserve"> </w:t>
+      </w:r>
+      <w:hyperlink r:id="rId21">
+        <w:r>
+          <w:rPr>
+            <w:rStyle w:val="Hyperlink"/>
+          </w:rPr>
+          <w:t xml:space="preserve">Project Guide</w:t>
+        </w:r>
+      </w:hyperlink>
+      <w:r>
+        <w:t xml:space="preserve">). What you open and show, in this order:</w:t>
+      </w:r>
+    </w:p>
+    <w:p>
+      <w:pPr>
+        <w:pStyle w:val="Compact"/>
+        <w:numPr>
+          <w:ilvl w:val="0"/>
+          <w:numId w:val="1002"/>
+        </w:numPr>
+      </w:pPr>
+      <w:r>
+        <w:t xml:space="preserve">The</w:t>
+      </w:r>
+      <w:r>
+        <w:t xml:space="preserve"> </w:t>
+      </w:r>
+      <w:r>
+        <w:rPr>
+          <w:b/>
+          <w:bCs/>
+        </w:rPr>
+        <w:t xml:space="preserve">home page</w:t>
+      </w:r>
+      <w:r>
+        <w:t xml:space="preserve"> </w:t>
+      </w:r>
+      <w:r>
+        <w:t xml:space="preserve">of the local site (</w:t>
+      </w:r>
+      <w:r>
+        <w:rPr>
+          <w:rStyle w:val="VerbatimChar"/>
+        </w:rPr>
+        <w:t xml:space="preserve">9-open-site-...</w:t>
+      </w:r>
+      <w:r>
+        <w:t xml:space="preserve">, on</w:t>
+      </w:r>
+      <w:r>
+        <w:t xml:space="preserve"> </w:t>
+      </w:r>
+      <w:r>
+        <w:rPr>
+          <w:rStyle w:val="VerbatimChar"/>
+        </w:rPr>
+        <w:t xml:space="preserve">http://localhost</w:t>
+      </w:r>
+      <w:r>
+        <w:t xml:space="preserve">).</w:t>
+      </w:r>
+    </w:p>
+    <w:p>
+      <w:pPr>
+        <w:pStyle w:val="Compact"/>
+        <w:numPr>
+          <w:ilvl w:val="0"/>
+          <w:numId w:val="1002"/>
+        </w:numPr>
+      </w:pPr>
+      <w:r>
+        <w:rPr>
+          <w:b/>
+          <w:bCs/>
+        </w:rPr>
+        <w:t xml:space="preserve">Each report page:</w:t>
+      </w:r>
+      <w:r>
+        <w:t xml:space="preserve"> </w:t>
+      </w:r>
+      <w:r>
+        <w:t xml:space="preserve">tests, code coverage, documentation coverage (Windows and Linux).</w:t>
+      </w:r>
+    </w:p>
+    <w:p>
+      <w:pPr>
+        <w:pStyle w:val="Compact"/>
+        <w:numPr>
+          <w:ilvl w:val="0"/>
+          <w:numId w:val="1002"/>
+        </w:numPr>
+      </w:pPr>
+      <w:r>
+        <w:t xml:space="preserve">The</w:t>
+      </w:r>
+      <w:r>
+        <w:t xml:space="preserve"> </w:t>
+      </w:r>
+      <w:r>
+        <w:rPr>
+          <w:b/>
+          <w:bCs/>
+        </w:rPr>
+        <w:t xml:space="preserve">API docs</w:t>
+      </w:r>
+      <w:r>
+        <w:t xml:space="preserve">.</w:t>
+      </w:r>
+    </w:p>
+    <w:p>
+      <w:pPr>
+        <w:pStyle w:val="Compact"/>
+        <w:numPr>
+          <w:ilvl w:val="0"/>
+          <w:numId w:val="1002"/>
+        </w:numPr>
+      </w:pPr>
+      <w:r>
+        <w:t xml:space="preserve">The</w:t>
+      </w:r>
+      <w:r>
+        <w:t xml:space="preserve"> </w:t>
+      </w:r>
+      <w:r>
+        <w:rPr>
+          <w:rStyle w:val="VerbatimChar"/>
+          <w:b/>
+          <w:bCs/>
+        </w:rPr>
+        <w:t xml:space="preserve">release/</w:t>
+      </w:r>
+      <w:r>
+        <w:rPr>
+          <w:b/>
+          <w:bCs/>
+        </w:rPr>
+        <w:t xml:space="preserve"> </w:t>
+      </w:r>
+      <w:r>
+        <w:rPr>
+          <w:b/>
+          <w:bCs/>
+        </w:rPr>
+        <w:t xml:space="preserve">folder</w:t>
+      </w:r>
+      <w:r>
+        <w:t xml:space="preserve"> </w:t>
+      </w:r>
+      <w:r>
+        <w:t xml:space="preserve">listing.</w:t>
+      </w:r>
+    </w:p>
+    <w:p>
+      <w:pPr>
+        <w:pStyle w:val="Compact"/>
+        <w:numPr>
+          <w:ilvl w:val="0"/>
+          <w:numId w:val="1002"/>
+        </w:numPr>
+      </w:pPr>
+      <w:r>
+        <w:rPr>
+          <w:b/>
+          <w:bCs/>
+        </w:rPr>
+        <w:t xml:space="preserve">Run the app</w:t>
+      </w:r>
+      <w:r>
+        <w:t xml:space="preserve"> </w:t>
+      </w:r>
+      <w:r>
+        <w:t xml:space="preserve">from the release archive.</w:t>
+      </w:r>
+    </w:p>
+    <w:p>
+      <w:pPr>
+        <w:pStyle w:val="Compact"/>
+        <w:numPr>
+          <w:ilvl w:val="0"/>
+          <w:numId w:val="1002"/>
+        </w:numPr>
+      </w:pPr>
+      <w:r>
+        <w:t xml:space="preserve">The</w:t>
+      </w:r>
+      <w:r>
+        <w:t xml:space="preserve"> </w:t>
+      </w:r>
+      <w:r>
+        <w:rPr>
+          <w:b/>
+          <w:bCs/>
+        </w:rPr>
+        <w:t xml:space="preserve">GitHub Release page</w:t>
+      </w:r>
+      <w:r>
+        <w:t xml:space="preserve"> </w:t>
+      </w:r>
+      <w:r>
+        <w:t xml:space="preserve">of your private repository (the instructor is a collaborator).</w:t>
+      </w:r>
+    </w:p>
+    <w:bookmarkEnd w:id="22"/>
+    <w:bookmarkEnd w:id="23"/>
     <w:sectPr>
       <w:headerReference r:id="rId9" w:type="default"/>
       <w:footerReference r:id="rId10" w:type="default"/>
@@ -448,11 +669,126 @@
       </w:rPr>
     </w:lvl>
   </w:abstractNum>
+  <w:abstractNum w:abstractNumId="99411">
+    <w:nsid w:val="00A99411"/>
+    <w:multiLevelType w:val="multilevel"/>
+    <w:lvl w:ilvl="0">
+      <w:start w:val="1"/>
+      <w:numFmt w:val="decimal"/>
+      <w:lvlText w:val="%1."/>
+      <w:lvlJc w:val="left"/>
+      <w:pPr>
+        <w:ind w:left="720" w:hanging="360"/>
+      </w:pPr>
+    </w:lvl>
+    <w:lvl w:ilvl="1">
+      <w:start w:val="1"/>
+      <w:numFmt w:val="decimal"/>
+      <w:lvlText w:val="%2."/>
+      <w:lvlJc w:val="left"/>
+      <w:pPr>
+        <w:ind w:left="1440" w:hanging="360"/>
+      </w:pPr>
+    </w:lvl>
+    <w:lvl w:ilvl="2">
+      <w:start w:val="1"/>
+      <w:numFmt w:val="decimal"/>
+      <w:lvlText w:val="%3."/>
+      <w:lvlJc w:val="left"/>
+      <w:pPr>
+        <w:ind w:left="2160" w:hanging="360"/>
+      </w:pPr>
+    </w:lvl>
+    <w:lvl w:ilvl="3">
+      <w:start w:val="1"/>
+      <w:numFmt w:val="decimal"/>
+      <w:lvlText w:val="%4."/>
+      <w:lvlJc w:val="left"/>
+      <w:pPr>
+        <w:ind w:left="2880" w:hanging="360"/>
+      </w:pPr>
+    </w:lvl>
+    <w:lvl w:ilvl="4">
+      <w:start w:val="1"/>
+      <w:numFmt w:val="decimal"/>
+      <w:lvlText w:val="%5."/>
+      <w:lvlJc w:val="left"/>
+      <w:pPr>
+        <w:ind w:left="3600" w:hanging="360"/>
+      </w:pPr>
+    </w:lvl>
+    <w:lvl w:ilvl="5">
+      <w:start w:val="1"/>
+      <w:numFmt w:val="decimal"/>
+      <w:lvlText w:val="%6."/>
+      <w:lvlJc w:val="left"/>
+      <w:pPr>
+        <w:ind w:left="4320" w:hanging="360"/>
+      </w:pPr>
+    </w:lvl>
+    <w:lvl w:ilvl="6">
+      <w:start w:val="1"/>
+      <w:numFmt w:val="decimal"/>
+      <w:lvlText w:val="%7."/>
+      <w:lvlJc w:val="left"/>
+      <w:pPr>
+        <w:ind w:left="5040" w:hanging="360"/>
+      </w:pPr>
+    </w:lvl>
+    <w:lvl w:ilvl="7">
+      <w:start w:val="1"/>
+      <w:numFmt w:val="decimal"/>
+      <w:lvlText w:val="%8."/>
+      <w:lvlJc w:val="left"/>
+      <w:pPr>
+        <w:ind w:left="5760" w:hanging="360"/>
+      </w:pPr>
+    </w:lvl>
+    <w:lvl w:ilvl="8">
+      <w:start w:val="1"/>
+      <w:numFmt w:val="decimal"/>
+      <w:lvlText w:val="%9."/>
+      <w:lvlJc w:val="left"/>
+      <w:pPr>
+        <w:ind w:left="6480" w:hanging="360"/>
+      </w:pPr>
+    </w:lvl>
+  </w:abstractNum>
   <w:num w:numId="1000">
     <w:abstractNumId w:val="990"/>
   </w:num>
   <w:num w:numId="1001">
     <w:abstractNumId w:val="991"/>
+  </w:num>
+  <w:num w:numId="1002">
+    <w:abstractNumId w:val="99411"/>
+    <w:lvlOverride w:ilvl="0">
+      <w:startOverride w:val="1"/>
+    </w:lvlOverride>
+    <w:lvlOverride w:ilvl="1">
+      <w:startOverride w:val="1"/>
+    </w:lvlOverride>
+    <w:lvlOverride w:ilvl="2">
+      <w:startOverride w:val="1"/>
+    </w:lvlOverride>
+    <w:lvlOverride w:ilvl="3">
+      <w:startOverride w:val="1"/>
+    </w:lvlOverride>
+    <w:lvlOverride w:ilvl="4">
+      <w:startOverride w:val="1"/>
+    </w:lvlOverride>
+    <w:lvlOverride w:ilvl="5">
+      <w:startOverride w:val="1"/>
+    </w:lvlOverride>
+    <w:lvlOverride w:ilvl="6">
+      <w:startOverride w:val="1"/>
+    </w:lvlOverride>
+    <w:lvlOverride w:ilvl="7">
+      <w:startOverride w:val="1"/>
+    </w:lvlOverride>
+    <w:lvlOverride w:ilvl="8">
+      <w:startOverride w:val="1"/>
+    </w:lvlOverride>
   </w:num>
 </w:numbering>
 </file>

</xml_diff>